<commit_message>
Applica i due tagli editoriali a 'Punto indietro'
Rimosse le due intrusioni del narratore: 'e non fu tempo sprecato,
quello, per nessuno' e il commento sulla pazienza di Caterina.
6.790 battute. Versione da concorso.

Co-Authored-By: Claude Fable 5 <noreply@anthropic.com>
Claude-Session: https://claude.ai/code/session_01FUZmtReNihnUGsF6SUL9WL
</commit_message>
<xml_diff>
--- a/concorso_percoto/Punto indietro.docx
+++ b/concorso_percoto/Punto indietro.docx
@@ -180,7 +180,7 @@
           <w:sz w:val="24"/>
           <w:szCs w:val="24"/>
         </w:rPr>
-        <w:t xml:space="preserve">Fu lì che Olga si sedette su una sedia in mezzo alla strada, davanti a tutti, e pianse. Non piano: come piove a maggio, fitto e senza vento. La gente che correva si fermò. Nessuno disse femine frede. Videro la donna che aveva cucito i vestiti dei loro morti piangere finalmente le sue lacrime e capirono, uno alla volta, che erano anche le loro: qualcuno si sedette per terra lì vicino e pianse con lei, e non fu tempo sprecato, quello, per nessuno. Olga pianse come si imbastisce: un filo lungo, lento, provvisorio, che tiene insieme i pezzi finché non può arrivare la cucitura vera.</w:t>
+        <w:t xml:space="preserve">Fu lì che Olga si sedette su una sedia in mezzo alla strada, davanti a tutti, e pianse. Non piano: come piove a maggio, fitto e senza vento. La gente che correva si fermò. Nessuno disse femine frede. Videro la donna che aveva cucito i vestiti dei loro morti piangere finalmente le sue lacrime e capirono, uno alla volta, che erano anche le loro: qualcuno si sedette per terra lì vicino e pianse con lei. Olga pianse come si imbastisce: un filo lungo, lento, provvisorio, che tiene insieme i pezzi finché non può arrivare la cucitura vera.</w:t>
       </w:r>
     </w:p>
     <w:p>
@@ -210,7 +210,7 @@
           <w:sz w:val="24"/>
           <w:szCs w:val="24"/>
         </w:rPr>
-        <w:t xml:space="preserve">La Singer uscì dalle macerie per la seconda volta in un anno, più scheggiata e più dura, e a novembre lavorava già nella baracca di legno che gli uomini avevano tirato su in tre domeniche. Caterina veniva ogni pomeriggio: aveva chiesto di imparare. Aveva le mani giovani, il vestito rosso sul fianco, e una pazienza che alla sua età di solito non c'è ancora.</w:t>
+        <w:t xml:space="preserve">La Singer uscì dalle macerie per la seconda volta in un anno, più scheggiata e più dura, e a novembre lavorava già nella baracca di legno che gli uomini avevano tirato su in tre domeniche. Caterina veniva ogni pomeriggio: aveva chiesto di imparare. Aveva le mani giovani e il vestito rosso sul fianco.</w:t>
       </w:r>
     </w:p>
     <w:p>

</xml_diff>